<commit_message>
Fix Git-normalized release manifest for v1.0.1
</commit_message>
<xml_diff>
--- a/docs/validation/technical_validation_protocol.docx
+++ b/docs/validation/technical_validation_protocol.docx
@@ -186,7 +186,7 @@
           <w:color w:val="64748B"/>
           <w:sz w:val="18"/>
         </w:rPr>
-        <w:t>Updated for release v1.0.0 | 2026-07-18</w:t>
+        <w:t>Updated for release v1.0.1 | 2026-07-18</w:t>
       </w:r>
     </w:p>
     <w:p>
@@ -1899,7 +1899,7 @@
         <w:pStyle w:val="Heading1"/>
       </w:pPr>
       <w:r>
-        <w:t>8. v1.0.0実行結果</w:t>
+        <w:t>8. v1.0.1実行結果</w:t>
       </w:r>
     </w:p>
     <w:tbl>
@@ -2120,7 +2120,7 @@
         <w:color w:val="64748B"/>
         <w:sz w:val="15"/>
       </w:rPr>
-      <w:t>Technical Validation protocol | release v1.0.0</w:t>
+      <w:t>Technical Validation protocol | release v1.0.1</w:t>
     </w:r>
   </w:p>
 </w:hdr>

</xml_diff>